<commit_message>
docs(relay): approve Test Runner PRD (dogfood milestone)
Flip PRPs/prds/test-runner.prd.md from DRAFT to APPROVED. All design
open questions are resolved (OQ #1 redaction policy, OQ #2 time budget,
OQ #3 layered execution); OQ #4 (phoenix-specific test commands)
continues deferred to implementation time as it requires validation
against the actual project.

Mark the corresponding TODO as done in docs/context/constraints.md with
a pointer to the next step (Phase 1: A1-A2 infrastructure against the
phoenix project).

Update docs/planning/planejamento_fase_2.docx from 0.10 to 0.11 with a
history row marking the milestone. This is the first artifact dogfooded
by the plugin — written manually against docs/context/prd-template.md
before the PRD Writer agent exists.

Co-Authored-By: Claude Opus 4.7 (1M context) <noreply@anthropic.com>
</commit_message>
<xml_diff>
--- a/docs/planning/planejamento_fase_2.docx
+++ b/docs/planning/planejamento_fase_2.docx
@@ -60,7 +60,7 @@
           <w:sz w:val="22"/>
           <w:szCs w:val="22"/>
         </w:rPr>
-        <w:t xml:space="preserve">Versão 0.10   ·   19 de abril de 2026</w:t>
+        <w:t xml:space="preserve">Versão 0.11   ·   19 de abril de 2026</w:t>
       </w:r>
     </w:p>
     <w:p>
@@ -1244,6 +1244,108 @@
             </w:pPr>
             <w:r>
               <w:t xml:space="preserve">Layered execution (unit → integration → e2e) definida como adaptativa: context-builder detecta sinais de camadas (diretórios separados, markers, comandos, scripts) na Fase 1 e ativa automaticamente; flat se não detectar. Falha em camada pula subsequentes (SKIPPED_UPSTREAM_FAILURE); retry re-executa da camada 1. Override por projeto via futuro .relay.yaml. B4 (Observações) e §10 (Riscos) atualizados. OQ #3 do PRD do Test Runner resolvida — só resta OQ #4 (phoenix-específico, valida na implementação).</w:t>
+            </w:r>
+          </w:p>
+        </w:tc>
+      </w:tr>
+      <w:tr>
+        <w:tc>
+          <w:tcPr>
+            <w:tcW w:type="dxa" w:w="1200"/>
+            <w:tcBorders>
+              <w:top w:val="single" w:color="CCCCCC" w:sz="1"/>
+              <w:left w:val="single" w:color="CCCCCC" w:sz="1"/>
+              <w:bottom w:val="single" w:color="CCCCCC" w:sz="1"/>
+              <w:right w:val="single" w:color="CCCCCC" w:sz="1"/>
+            </w:tcBorders>
+            <w:tcMar>
+              <w:top w:type="dxa" w:w="100"/>
+              <w:left w:type="dxa" w:w="140"/>
+              <w:bottom w:type="dxa" w:w="100"/>
+              <w:right w:type="dxa" w:w="140"/>
+            </w:tcMar>
+          </w:tcPr>
+          <w:p>
+            <w:pPr>
+              <w:spacing w:after="40"/>
+            </w:pPr>
+            <w:r>
+              <w:t xml:space="preserve">0.11</w:t>
+            </w:r>
+          </w:p>
+        </w:tc>
+        <w:tc>
+          <w:tcPr>
+            <w:tcW w:type="dxa" w:w="1600"/>
+            <w:tcBorders>
+              <w:top w:val="single" w:color="CCCCCC" w:sz="1"/>
+              <w:left w:val="single" w:color="CCCCCC" w:sz="1"/>
+              <w:bottom w:val="single" w:color="CCCCCC" w:sz="1"/>
+              <w:right w:val="single" w:color="CCCCCC" w:sz="1"/>
+            </w:tcBorders>
+            <w:tcMar>
+              <w:top w:type="dxa" w:w="100"/>
+              <w:left w:type="dxa" w:w="140"/>
+              <w:bottom w:type="dxa" w:w="100"/>
+              <w:right w:type="dxa" w:w="140"/>
+            </w:tcMar>
+          </w:tcPr>
+          <w:p>
+            <w:pPr>
+              <w:spacing w:after="40"/>
+            </w:pPr>
+            <w:r>
+              <w:t xml:space="preserve">2026-04-19</w:t>
+            </w:r>
+          </w:p>
+        </w:tc>
+        <w:tc>
+          <w:tcPr>
+            <w:tcW w:type="dxa" w:w="2500"/>
+            <w:tcBorders>
+              <w:top w:val="single" w:color="CCCCCC" w:sz="1"/>
+              <w:left w:val="single" w:color="CCCCCC" w:sz="1"/>
+              <w:bottom w:val="single" w:color="CCCCCC" w:sz="1"/>
+              <w:right w:val="single" w:color="CCCCCC" w:sz="1"/>
+            </w:tcBorders>
+            <w:tcMar>
+              <w:top w:type="dxa" w:w="100"/>
+              <w:left w:type="dxa" w:w="140"/>
+              <w:bottom w:type="dxa" w:w="100"/>
+              <w:right w:type="dxa" w:w="140"/>
+            </w:tcMar>
+          </w:tcPr>
+          <w:p>
+            <w:pPr>
+              <w:spacing w:after="40"/>
+            </w:pPr>
+            <w:r>
+              <w:t xml:space="preserve">PRD do Test Runner aprovado (milestone)</w:t>
+            </w:r>
+          </w:p>
+        </w:tc>
+        <w:tc>
+          <w:tcPr>
+            <w:tcW w:type="dxa" w:w="4060"/>
+            <w:tcBorders>
+              <w:top w:val="single" w:color="CCCCCC" w:sz="1"/>
+              <w:left w:val="single" w:color="CCCCCC" w:sz="1"/>
+              <w:bottom w:val="single" w:color="CCCCCC" w:sz="1"/>
+              <w:right w:val="single" w:color="CCCCCC" w:sz="1"/>
+            </w:tcBorders>
+            <w:tcMar>
+              <w:top w:type="dxa" w:w="100"/>
+              <w:left w:type="dxa" w:w="140"/>
+              <w:bottom w:type="dxa" w:w="100"/>
+              <w:right w:type="dxa" w:w="140"/>
+            </w:tcMar>
+          </w:tcPr>
+          <w:p>
+            <w:pPr>
+              <w:spacing w:after="40"/>
+            </w:pPr>
+            <w:r>
+              <w:t xml:space="preserve">PRD do Test Runner (PRPs/prds/test-runner.prd.md) aprovado. Todas as OQs de design resolvidas; OQ #4 (comandos de teste específicos do phoenix) continua deferida para validação no início da implementação. Próximo passo: Phase 1 (A1–A2 infra: Docker Compose + bootstrap determinístico) contra o projeto phoenix. Este é o primeiro artefato dogfoodado do plugin relay — escrito à mão, seguindo docs/context/prd-template.md, antes do PRD Writer agent existir.</w:t>
             </w:r>
           </w:p>
         </w:tc>

</xml_diff>